<commit_message>
Fix: dynamic status in confirmation table; conditional balance message in IPCW_Explainer
Co-authored-by: dreamcheap2000 <229635625+dreamcheap2000@users.noreply.github.com>
</commit_message>
<xml_diff>
--- a/IPCW_Explainer.docx
+++ b/IPCW_Explainer.docx
@@ -2387,7 +2387,7 @@
           </w:tcPr>
           <w:p>
             <w:r>
-              <w:t>✓</w:t>
+              <w:t>✓ Confirmed</w:t>
             </w:r>
           </w:p>
         </w:tc>
@@ -2429,7 +2429,7 @@
           </w:tcPr>
           <w:p>
             <w:r>
-              <w:t>✓</w:t>
+              <w:t>✓ Confirmed</w:t>
             </w:r>
           </w:p>
         </w:tc>
@@ -2474,7 +2474,7 @@
           </w:tcPr>
           <w:p>
             <w:r>
-              <w:t>✓</w:t>
+              <w:t>✓ Confirmed</w:t>
             </w:r>
           </w:p>
         </w:tc>
@@ -2516,7 +2516,7 @@
           </w:tcPr>
           <w:p>
             <w:r>
-              <w:t>✓</w:t>
+              <w:t>✓ Confirmed</w:t>
             </w:r>
           </w:p>
         </w:tc>
@@ -2561,7 +2561,7 @@
           </w:tcPr>
           <w:p>
             <w:r>
-              <w:t>✓</w:t>
+              <w:t>✓ Confirmed</w:t>
             </w:r>
           </w:p>
         </w:tc>
@@ -2603,7 +2603,7 @@
           </w:tcPr>
           <w:p>
             <w:r>
-              <w:t>✓</w:t>
+              <w:t>✓ Confirmed</w:t>
             </w:r>
           </w:p>
         </w:tc>
@@ -2648,7 +2648,7 @@
           </w:tcPr>
           <w:p>
             <w:r>
-              <w:t>✓</w:t>
+              <w:t>✓ Confirmed</w:t>
             </w:r>
           </w:p>
         </w:tc>
@@ -2690,7 +2690,7 @@
           </w:tcPr>
           <w:p>
             <w:r>
-              <w:t>✓</w:t>
+              <w:t>✓ Confirmed</w:t>
             </w:r>
           </w:p>
         </w:tc>
@@ -2735,7 +2735,7 @@
           </w:tcPr>
           <w:p>
             <w:r>
-              <w:t>✓</w:t>
+              <w:t>✓ Confirmed</w:t>
             </w:r>
           </w:p>
         </w:tc>
@@ -2777,7 +2777,7 @@
           </w:tcPr>
           <w:p>
             <w:r>
-              <w:t>✓</w:t>
+              <w:t>✓ Confirmed</w:t>
             </w:r>
           </w:p>
         </w:tc>
@@ -2822,7 +2822,7 @@
           </w:tcPr>
           <w:p>
             <w:r>
-              <w:t>✓</w:t>
+              <w:t>✓ Confirmed</w:t>
             </w:r>
           </w:p>
         </w:tc>

</xml_diff>